<commit_message>
Update training pay to $1.25/sq ft and add plain-language starting pay notice
Per feedback: all new installers start at $1.25/sq ft training rate with
clear written statement that pay increases as skills improve.

https://claude.ai/code/session_01KRNYEeKsxcG7EUwBATPyAU
</commit_message>
<xml_diff>
--- a/wallpaper-installer-expectations.docx
+++ b/wallpaper-installer-expectations.docx
@@ -361,7 +361,7 @@
                 <w:i w:val="0"/>
                 <w:sz w:val="21"/>
               </w:rPr>
-              <w:t>$1.50 – $1.75</w:t>
+              <w:t>$1.25/sq ft</w:t>
             </w:r>
           </w:p>
         </w:tc>
@@ -380,7 +380,7 @@
                 <w:i w:val="0"/>
                 <w:sz w:val="21"/>
               </w:rPr>
-              <w:t>Working under supervision</w:t>
+              <w:t>Starting rate — all new installers begin here</w:t>
             </w:r>
           </w:p>
         </w:tc>
@@ -506,6 +506,19 @@
         </w:tc>
       </w:tr>
     </w:tbl>
+    <w:p>
+      <w:pPr>
+        <w:spacing w:before="200" w:after="120"/>
+      </w:pPr>
+      <w:r>
+        <w:rPr>
+          <w:b w:val="0"/>
+          <w:i w:val="0"/>
+          <w:sz w:val="21"/>
+        </w:rPr>
+        <w:t>All new installers start at the Training Pay rate of $1.25 per square foot. This is your starting pay while you learn our standards and processes. As your skills, speed, and quality improve, your pay rate will increase accordingly.</w:t>
+      </w:r>
+    </w:p>
     <w:p>
       <w:pPr>
         <w:spacing w:before="120" w:after="40"/>

</xml_diff>